<commit_message>
nal 3.2 layout ne dela
</commit_message>
<xml_diff>
--- a/Layouts/RentalOverview.docx
+++ b/Layouts/RentalOverview.docx
@@ -638,11 +638,6 @@
                         <w:sdtContent>
                           <w:proofErr w:type="spellStart"/>
                           <w:r>
-                            <w:rPr>
-                              <w:rStyle w:val="Besedilooznabemesta"/>
-                              <w:b/>
-                              <w:bCs/>
-                            </w:rPr>
                             <w:t>TotalAmount</w:t>
                           </w:r>
                           <w:proofErr w:type="spellEnd"/>
@@ -659,6 +654,345 @@
         </w:sdt>
       </w:sdtContent>
     </w:sdt>
+    <w:p>
+      <w:r>
+        <w:rPr>
+          <w:b/>
+          <w:bCs/>
+          <w:sz w:val="36"/>
+          <w:szCs w:val="36"/>
+        </w:rPr>
+        <w:t>Pregled izposoje po strank</w:t>
+      </w:r>
+      <w:r>
+        <w:rPr>
+          <w:b/>
+          <w:bCs/>
+          <w:sz w:val="36"/>
+          <w:szCs w:val="36"/>
+        </w:rPr>
+        <w:t xml:space="preserve">ah </w:t>
+      </w:r>
+    </w:p>
+    <w:p>
+      <w:r>
+        <w:t>Datum:</w:t>
+      </w:r>
+    </w:p>
+    <w:p>
+      <w:r>
+        <w:t xml:space="preserve">Stranka: </w:t>
+      </w:r>
+      <w:sdt>
+        <w:sdtPr>
+          <w:alias w:val="#Nav: /Customer/CustomerName"/>
+          <w:tag w:val="#Nav: Rental_Report/50110"/>
+          <w:id w:val="1992910887"/>
+          <w:placeholder>
+            <w:docPart w:val="DefaultPlaceholder_-1854013440"/>
+          </w:placeholder>
+          <w:dataBinding w:prefixMappings="xmlns:ns0='urn:microsoft-dynamics-nav/reports/Rental_Report/50110/' " w:xpath="/ns0:NavWordReportXmlPart[1]/ns0:Customer[1]/ns0:CustomerName[1]" w:storeItemID="{6389AB1D-60AA-47E6-A136-9AE9D2615019}"/>
+          <w:text/>
+        </w:sdtPr>
+        <w:sdtContent>
+          <w:proofErr w:type="spellStart"/>
+          <w:r>
+            <w:t>CustomerName</w:t>
+          </w:r>
+          <w:proofErr w:type="spellEnd"/>
+        </w:sdtContent>
+      </w:sdt>
+      <w:r>
+        <w:t xml:space="preserve"> (</w:t>
+      </w:r>
+      <w:proofErr w:type="spellStart"/>
+      <w:sdt>
+        <w:sdtPr>
+          <w:alias w:val="#Nav: /Customer/CustomerNo"/>
+          <w:tag w:val="#Nav: Rental_Report/50110"/>
+          <w:id w:val="-1680884310"/>
+          <w:placeholder>
+            <w:docPart w:val="DefaultPlaceholder_-1854013440"/>
+          </w:placeholder>
+          <w:dataBinding w:prefixMappings="xmlns:ns0='urn:microsoft-dynamics-nav/reports/Rental_Report/50110/' " w:xpath="/ns0:NavWordReportXmlPart[1]/ns0:Customer[1]/ns0:CustomerNo[1]" w:storeItemID="{6389AB1D-60AA-47E6-A136-9AE9D2615019}"/>
+          <w:text/>
+        </w:sdtPr>
+        <w:sdtContent>
+          <w:r>
+            <w:t>CustomerNo</w:t>
+          </w:r>
+          <w:proofErr w:type="spellEnd"/>
+        </w:sdtContent>
+      </w:sdt>
+      <w:r>
+        <w:t>)</w:t>
+      </w:r>
+    </w:p>
+    <w:p>
+      <w:r>
+        <w:t xml:space="preserve">Status: </w:t>
+      </w:r>
+      <w:sdt>
+        <w:sdtPr>
+          <w:alias w:val="#Nav: /Customer/RentalHeader/Status"/>
+          <w:tag w:val="#Nav: Rental_Report/50110"/>
+          <w:id w:val="1883824953"/>
+          <w:placeholder>
+            <w:docPart w:val="DefaultPlaceholder_-1854013440"/>
+          </w:placeholder>
+          <w:dataBinding w:prefixMappings="xmlns:ns0='urn:microsoft-dynamics-nav/reports/Rental_Report/50110/' " w:xpath="/ns0:NavWordReportXmlPart[1]/ns0:Customer[1]/ns0:RentalHeader[1]/ns0:Status[1]" w:storeItemID="{6389AB1D-60AA-47E6-A136-9AE9D2615019}"/>
+          <w:text/>
+        </w:sdtPr>
+        <w:sdtContent>
+          <w:r>
+            <w:t>Status</w:t>
+          </w:r>
+        </w:sdtContent>
+      </w:sdt>
+    </w:p>
+    <w:tbl>
+      <w:tblPr>
+        <w:tblStyle w:val="Tabelamrea"/>
+        <w:tblW w:w="0" w:type="auto"/>
+        <w:tblLook w:val="04A0" w:firstRow="1" w:lastRow="0" w:firstColumn="1" w:lastColumn="0" w:noHBand="0" w:noVBand="1"/>
+      </w:tblPr>
+      <w:tblGrid>
+        <w:gridCol w:w="1925"/>
+        <w:gridCol w:w="1925"/>
+        <w:gridCol w:w="1926"/>
+        <w:gridCol w:w="1926"/>
+        <w:gridCol w:w="1926"/>
+      </w:tblGrid>
+      <w:sdt>
+        <w:sdtPr>
+          <w:id w:val="1899781504"/>
+          <w15:dataBinding w:prefixMappings="xmlns:ns0='urn:microsoft-dynamics-nav/reports/Rental_Report/50110/' " w:xpath="/ns0:NavWordReportXmlPart[1]/ns0:Customer[1]/ns0:RentalHeader" w:storeItemID="{6389AB1D-60AA-47E6-A136-9AE9D2615019}"/>
+          <w15:repeatingSection/>
+          <w:alias w:val="#Nav: /Customer/RentalHeader"/>
+          <w:tag w:val="#Nav: Rental_Report/50110"/>
+        </w:sdtPr>
+        <w:sdtContent>
+          <w:sdt>
+            <w:sdtPr>
+              <w:id w:val="1015802786"/>
+              <w:placeholder>
+                <w:docPart w:val="DefaultPlaceholder_-1854013435"/>
+              </w:placeholder>
+              <w15:repeatingSectionItem/>
+            </w:sdtPr>
+            <w:sdtContent>
+              <w:tr>
+                <w:tc>
+                  <w:tcPr>
+                    <w:tcW w:w="1925" w:type="dxa"/>
+                  </w:tcPr>
+                  <w:p>
+                    <w:r>
+                      <w:t>Kolo</w:t>
+                    </w:r>
+                  </w:p>
+                </w:tc>
+                <w:tc>
+                  <w:tcPr>
+                    <w:tcW w:w="1925" w:type="dxa"/>
+                  </w:tcPr>
+                  <w:p>
+                    <w:r>
+                      <w:t>Opis</w:t>
+                    </w:r>
+                  </w:p>
+                </w:tc>
+                <w:tc>
+                  <w:tcPr>
+                    <w:tcW w:w="1926" w:type="dxa"/>
+                  </w:tcPr>
+                  <w:p>
+                    <w:r>
+                      <w:t>Dni</w:t>
+                    </w:r>
+                  </w:p>
+                </w:tc>
+                <w:tc>
+                  <w:tcPr>
+                    <w:tcW w:w="1926" w:type="dxa"/>
+                  </w:tcPr>
+                  <w:p>
+                    <w:r>
+                      <w:t>Cena</w:t>
+                    </w:r>
+                  </w:p>
+                </w:tc>
+                <w:tc>
+                  <w:tcPr>
+                    <w:tcW w:w="1926" w:type="dxa"/>
+                  </w:tcPr>
+                  <w:p>
+                    <w:r>
+                      <w:t>Znesek</w:t>
+                    </w:r>
+                  </w:p>
+                </w:tc>
+              </w:tr>
+            </w:sdtContent>
+          </w:sdt>
+        </w:sdtContent>
+      </w:sdt>
+      <w:sdt>
+        <w:sdtPr>
+          <w:alias w:val="#Nav: /Customer/RentalHeader/RentalLine"/>
+          <w:tag w:val="#Nav: Rental_Report/50110"/>
+          <w:id w:val="197359118"/>
+          <w15:dataBinding w:prefixMappings="xmlns:ns0='urn:microsoft-dynamics-nav/reports/Rental_Report/50110/' " w:xpath="/ns0:NavWordReportXmlPart[1]/ns0:Customer[1]/ns0:RentalHeader[1]/ns0:RentalLine" w:storeItemID="{6389AB1D-60AA-47E6-A136-9AE9D2615019}"/>
+          <w15:repeatingSection/>
+        </w:sdtPr>
+        <w:sdtContent>
+          <w:sdt>
+            <w:sdtPr>
+              <w:id w:val="39556341"/>
+              <w:placeholder>
+                <w:docPart w:val="DefaultPlaceholder_-1854013435"/>
+              </w:placeholder>
+              <w15:repeatingSectionItem/>
+            </w:sdtPr>
+            <w:sdtContent>
+              <w:tr>
+                <w:sdt>
+                  <w:sdtPr>
+                    <w:alias w:val="#Nav: /Customer/RentalHeader/RentalLine/BicycleNo"/>
+                    <w:tag w:val="#Nav: Rental_Report/50110"/>
+                    <w:id w:val="2044553765"/>
+                    <w:placeholder>
+                      <w:docPart w:val="DefaultPlaceholder_-1854013440"/>
+                    </w:placeholder>
+                    <w:dataBinding w:prefixMappings="xmlns:ns0='urn:microsoft-dynamics-nav/reports/Rental_Report/50110/' " w:xpath="/ns0:NavWordReportXmlPart[1]/ns0:Customer[1]/ns0:RentalHeader[1]/ns0:RentalLine[1]/ns0:BicycleNo[1]" w:storeItemID="{6389AB1D-60AA-47E6-A136-9AE9D2615019}"/>
+                    <w:text/>
+                  </w:sdtPr>
+                  <w:sdtContent>
+                    <w:tc>
+                      <w:tcPr>
+                        <w:tcW w:w="1925" w:type="dxa"/>
+                      </w:tcPr>
+                      <w:p>
+                        <w:proofErr w:type="spellStart"/>
+                        <w:r>
+                          <w:t>BicycleNo</w:t>
+                        </w:r>
+                        <w:proofErr w:type="spellEnd"/>
+                      </w:p>
+                    </w:tc>
+                  </w:sdtContent>
+                </w:sdt>
+                <w:sdt>
+                  <w:sdtPr>
+                    <w:alias w:val="#Nav: /Customer/RentalHeader/RentalLine/Description"/>
+                    <w:tag w:val="#Nav: Rental_Report/50110"/>
+                    <w:id w:val="1135603615"/>
+                    <w:placeholder>
+                      <w:docPart w:val="DefaultPlaceholder_-1854013440"/>
+                    </w:placeholder>
+                    <w:dataBinding w:prefixMappings="xmlns:ns0='urn:microsoft-dynamics-nav/reports/Rental_Report/50110/' " w:xpath="/ns0:NavWordReportXmlPart[1]/ns0:Customer[1]/ns0:RentalHeader[1]/ns0:RentalLine[1]/ns0:Description[1]" w:storeItemID="{6389AB1D-60AA-47E6-A136-9AE9D2615019}"/>
+                    <w:text/>
+                  </w:sdtPr>
+                  <w:sdtContent>
+                    <w:tc>
+                      <w:tcPr>
+                        <w:tcW w:w="1925" w:type="dxa"/>
+                      </w:tcPr>
+                      <w:p>
+                        <w:proofErr w:type="spellStart"/>
+                        <w:r>
+                          <w:t>Description</w:t>
+                        </w:r>
+                        <w:proofErr w:type="spellEnd"/>
+                      </w:p>
+                    </w:tc>
+                  </w:sdtContent>
+                </w:sdt>
+                <w:sdt>
+                  <w:sdtPr>
+                    <w:alias w:val="#Nav: /Customer/RentalHeader/RentalLine/RentalDays"/>
+                    <w:tag w:val="#Nav: Rental_Report/50110"/>
+                    <w:id w:val="-1223979685"/>
+                    <w:placeholder>
+                      <w:docPart w:val="DefaultPlaceholder_-1854013440"/>
+                    </w:placeholder>
+                    <w:dataBinding w:prefixMappings="xmlns:ns0='urn:microsoft-dynamics-nav/reports/Rental_Report/50110/' " w:xpath="/ns0:NavWordReportXmlPart[1]/ns0:Customer[1]/ns0:RentalHeader[1]/ns0:RentalLine[1]/ns0:RentalDays[1]" w:storeItemID="{6389AB1D-60AA-47E6-A136-9AE9D2615019}"/>
+                    <w:text/>
+                  </w:sdtPr>
+                  <w:sdtContent>
+                    <w:tc>
+                      <w:tcPr>
+                        <w:tcW w:w="1926" w:type="dxa"/>
+                      </w:tcPr>
+                      <w:p>
+                        <w:proofErr w:type="spellStart"/>
+                        <w:r>
+                          <w:t>RentalDays</w:t>
+                        </w:r>
+                        <w:proofErr w:type="spellEnd"/>
+                      </w:p>
+                    </w:tc>
+                  </w:sdtContent>
+                </w:sdt>
+                <w:sdt>
+                  <w:sdtPr>
+                    <w:alias w:val="#Nav: /Customer/RentalHeader/RentalLine/DailyRate"/>
+                    <w:tag w:val="#Nav: Rental_Report/50110"/>
+                    <w:id w:val="-1763136938"/>
+                    <w:placeholder>
+                      <w:docPart w:val="DefaultPlaceholder_-1854013440"/>
+                    </w:placeholder>
+                    <w:dataBinding w:prefixMappings="xmlns:ns0='urn:microsoft-dynamics-nav/reports/Rental_Report/50110/' " w:xpath="/ns0:NavWordReportXmlPart[1]/ns0:Customer[1]/ns0:RentalHeader[1]/ns0:RentalLine[1]/ns0:DailyRate[1]" w:storeItemID="{6389AB1D-60AA-47E6-A136-9AE9D2615019}"/>
+                    <w:text/>
+                  </w:sdtPr>
+                  <w:sdtContent>
+                    <w:tc>
+                      <w:tcPr>
+                        <w:tcW w:w="1926" w:type="dxa"/>
+                      </w:tcPr>
+                      <w:p>
+                        <w:proofErr w:type="spellStart"/>
+                        <w:r>
+                          <w:t>DailyRate</w:t>
+                        </w:r>
+                        <w:proofErr w:type="spellEnd"/>
+                      </w:p>
+                    </w:tc>
+                  </w:sdtContent>
+                </w:sdt>
+                <w:sdt>
+                  <w:sdtPr>
+                    <w:alias w:val="#Nav: /Customer/RentalHeader/RentalLine/LineAmount"/>
+                    <w:tag w:val="#Nav: Rental_Report/50110"/>
+                    <w:id w:val="-2091540530"/>
+                    <w:placeholder>
+                      <w:docPart w:val="DefaultPlaceholder_-1854013440"/>
+                    </w:placeholder>
+                    <w:dataBinding w:prefixMappings="xmlns:ns0='urn:microsoft-dynamics-nav/reports/Rental_Report/50110/' " w:xpath="/ns0:NavWordReportXmlPart[1]/ns0:Customer[1]/ns0:RentalHeader[1]/ns0:RentalLine[1]/ns0:LineAmount[1]" w:storeItemID="{6389AB1D-60AA-47E6-A136-9AE9D2615019}"/>
+                    <w:text/>
+                  </w:sdtPr>
+                  <w:sdtContent>
+                    <w:tc>
+                      <w:tcPr>
+                        <w:tcW w:w="1926" w:type="dxa"/>
+                      </w:tcPr>
+                      <w:p>
+                        <w:proofErr w:type="spellStart"/>
+                        <w:r>
+                          <w:t>LineAmount</w:t>
+                        </w:r>
+                        <w:proofErr w:type="spellEnd"/>
+                      </w:p>
+                    </w:tc>
+                  </w:sdtContent>
+                </w:sdt>
+              </w:tr>
+            </w:sdtContent>
+          </w:sdt>
+        </w:sdtContent>
+      </w:sdt>
+    </w:tbl>
+    <w:p/>
     <w:sectPr>
       <w:pgSz w:w="11906" w:h="16838"/>
       <w:pgMar w:top="1701" w:right="1134" w:bottom="1701" w:left="1134" w:header="708" w:footer="708" w:gutter="0"/>
@@ -1069,6 +1403,7 @@
   <w:style w:type="paragraph" w:default="1" w:styleId="Navaden">
     <w:name w:val="Normal"/>
     <w:qFormat/>
+    <w:rsid w:val="00A60E87"/>
   </w:style>
   <w:style w:type="character" w:default="1" w:styleId="Privzetapisavaodstavka">
     <w:name w:val="Default Paragraph Font"/>
@@ -1229,11 +1564,26 @@
   </w:compat>
   <w:rsids>
     <w:rsidRoot w:val="00577FAD"/>
+    <w:rsid w:val="001B4785"/>
+    <w:rsid w:val="00232DD3"/>
+    <w:rsid w:val="00497B97"/>
+    <w:rsid w:val="004B68AC"/>
     <w:rsid w:val="00577FAD"/>
+    <w:rsid w:val="005B7855"/>
+    <w:rsid w:val="006A505B"/>
+    <w:rsid w:val="007E6A57"/>
+    <w:rsid w:val="008F2BFA"/>
     <w:rsid w:val="008F360B"/>
+    <w:rsid w:val="00914DCC"/>
+    <w:rsid w:val="009171AC"/>
+    <w:rsid w:val="00A52F30"/>
+    <w:rsid w:val="00BD147A"/>
     <w:rsid w:val="00CC1AE1"/>
+    <w:rsid w:val="00E06D92"/>
+    <w:rsid w:val="00E22151"/>
     <w:rsid w:val="00E42B95"/>
     <w:rsid w:val="00EB656E"/>
+    <w:rsid w:val="00F52A52"/>
   </w:rsids>
   <m:mathPr>
     <m:mathFont m:val="Cambria Math"/>
@@ -1689,7 +2039,7 @@
     <w:basedOn w:val="Privzetapisavaodstavka"/>
     <w:uiPriority w:val="99"/>
     <w:semiHidden/>
-    <w:rsid w:val="00577FAD"/>
+    <w:rsid w:val="00E06D92"/>
     <w:rPr>
       <w:color w:val="666666"/>
     </w:rPr>
@@ -1999,7 +2349,7 @@
 </a:theme>
 </file>
 
-<file path=customXml/item1.xml>��< ? x m l   v e r s i o n = " 1 . 0 "   e n c o d i n g = " u t f - 1 6 " ? > < N a v W o r d R e p o r t X m l P a r t   x m l n s = " u r n : m i c r o s o f t - d y n a m i c s - b u s i n e s s c e n t r a l / i n t e r n a l / e x t e n d e d / r e p o r t s / R e n t a l _ R e p o r t / 5 0 1 1 0 / " > +<file path=customXml/item1.xml>��< ? x m l   v e r s i o n = " 1 . 0 "   e n c o d i n g = " u t f - 1 6 " ? > < N a v W o r d R e p o r t X m l P a r t   x m l n s = " u r n : m i c r o s o f t - d y n a m i c s - n a v / r e p o r t s / R e n t a l _ R e p o r t / 5 0 1 1 0 / " >   
      < B C R e p o r t I n f o r m a t i o n >   
@@ -2065,53 +2415,37 @@
  
      < / B C R e p o r t I n f o r m a t i o n >   
-     < T o o l t i p s > - 
-         < T o o l t i p   c o l u m n = " C u s t o m e r N o "   E l e m e n t I d = " 1 5 4 2 0 5 1 5 6 0 " > - 
-             < T o o l t i p T e x t   l a n g = " e n - U S " > S p e c i f i e s   t h e   n u m b e r   o f   t h e   c u s t o m e r .   T h e   f i e l d   i s   e i t h e r   f i l l e d   a u t o m a t i c a l l y   f r o m   a   d e f i n e d   n u m b e r   s e r i e s ,   o r   y o u   e n t e r   t h e   n u m b e r   m a n u a l l y   b e c a u s e   y o u   h a v e   e n a b l e d   m a n u a l   n u m b e r   e n t r y   i n   t h e   n u m b e r - s e r i e s   s e t u p . < / T o o l t i p T e x t > - 
-         < / T o o l t i p > - 
-         < T o o l t i p   c o l u m n = " C u s t o m e r N a m e "   E l e m e n t I d = " 2 6 5 4 9 6 8 2 6 " > - 
-             < T o o l t i p T e x t   l a n g = " e n - U S " > S p e c i f i e s   t h e   c u s t o m e r ' s   n a m e   t h a t   a p p e a r s   o n   a l l   r e l a t e d   d o c u m e n t s .   F o r   c o m p a n i e s ,   s p e c i f y   t h e   c o m p a n y ' s   n a m e   h e r e ,   a n d   t h e n   a d d   t h e   r e l e v a n t   p e o p l e   a s   c o n t a c t s   t h a t   y o u   l i n k   t o   t h i s   c u s t o m e r . < / T o o l t i p T e x t > - 
-         < / T o o l t i p > - 
-     < / T o o l t i p s > - 
-     < C u s t o m e r   E l e m e n t T y p e = " D a t a I t e m "   E l e m e n t I d = " 1 5 2 5 1 9 1 9 9 " > - 
-         < C u s t o m e r N a m e   E l e m e n t T y p e = " C o l u m n "   E l e m e n t I d = " 2 6 5 4 9 6 8 2 6 "   D a t a T y p e = " T e x t " > C u s t o m e r N a m e < / C u s t o m e r N a m e > - 
-         < C u s t o m e r N o   E l e m e n t T y p e = " C o l u m n "   E l e m e n t I d = " 1 5 4 2 0 5 1 5 6 0 "   D a t a T y p e = " C o d e " > C u s t o m e r N o < / C u s t o m e r N o > - 
-         < R e n t a l H e a d e r   E l e m e n t T y p e = " D a t a I t e m "   E l e m e n t I d = " 2 1 4 2 5 9 3 9 4 6 " > - 
-             < A c t u a l R e t u r n D a t e   E l e m e n t T y p e = " C o l u m n "   E l e m e n t I d = " 6 7 7 3 7 2 1 5 5 "   D a t a T y p e = " D a t e " > A c t u a l R e t u r n D a t e < / A c t u a l R e t u r n D a t e > - 
-             < E x p e c t e d R e t u r n D a t e   E l e m e n t T y p e = " C o l u m n "   E l e m e n t I d = " 1 2 3 1 5 5 3 4 0 5 "   D a t a T y p e = " D a t e " > E x p e c t e d R e t u r n D a t e < / E x p e c t e d R e t u r n D a t e > - 
-             < R e n t a l D a t e   E l e m e n t T y p e = " C o l u m n "   E l e m e n t I d = " 5 9 7 4 3 5 9 5 9 "   D a t a T y p e = " D a t e " > R e n t a l D a t e < / R e n t a l D a t e > - 
-             < R e n t a l N o   E l e m e n t T y p e = " C o l u m n "   E l e m e n t I d = " 1 4 6 3 9 1 2 9 0 8 "   D a t a T y p e = " C o d e " > R e n t a l N o < / R e n t a l N o > - 
-             < S t a t u s   E l e m e n t T y p e = " C o l u m n "   E l e m e n t I d = " 1 6 3 4 1 4 4 5 5 1 "   D a t a T y p e = " E n u m " > S t a t u s < / S t a t u s > - 
-             < T o t a l A m o u n t   E l e m e n t T y p e = " C o l u m n "   E l e m e n t I d = " 1 5 5 9 1 6 4 8 7 7 "   D a t a T y p e = " D e c i m a l " > T o t a l A m o u n t < / T o t a l A m o u n t > - 
-             < R e n t a l L i n e   E l e m e n t T y p e = " D a t a I t e m "   E l e m e n t I d = " 1 1 8 7 4 3 2 4 9 9 " > - 
-                 < B i c y c l e N o   E l e m e n t T y p e = " C o l u m n "   E l e m e n t I d = " 1 1 8 7 4 1 5 8 9 7 "   D a t a T y p e = " C o d e " > B i c y c l e N o < / B i c y c l e N o > - 
-                 < D a i l y R a t e   E l e m e n t T y p e = " C o l u m n "   E l e m e n t I d = " 1 5 3 7 8 3 1 9 4 2 "   D a t a T y p e = " D e c i m a l " > D a i l y R a t e < / D a i l y R a t e > - 
-                 < D e s c r i p t i o n   E l e m e n t T y p e = " C o l u m n "   E l e m e n t I d = " 1 3 1 4 3 5 1 3 0 7 "   D a t a T y p e = " T e x t " > D e s c r i p t i o n < / D e s c r i p t i o n > - 
-                 < L i n e A m o u n t   E l e m e n t T y p e = " C o l u m n "   E l e m e n t I d = " 1 6 4 5 5 1 1 0 0 1 "   D a t a T y p e = " D e c i m a l " > L i n e A m o u n t < / L i n e A m o u n t > - 
-                 < R e n t a l D a y s   E l e m e n t T y p e = " C o l u m n "   E l e m e n t I d = " 1 5 2 4 4 1 0 3 1 8 "   D a t a T y p e = " I n t e g e r " > R e n t a l D a y s < / R e n t a l D a y s > +     < C u s t o m e r > + 
+         < C u s t o m e r N a m e > C u s t o m e r N a m e < / C u s t o m e r N a m e > + 
+         < C u s t o m e r N o > C u s t o m e r N o < / C u s t o m e r N o > + 
+         < R e n t a l H e a d e r > + 
+             < A c t u a l R e t u r n D a t e > A c t u a l R e t u r n D a t e < / A c t u a l R e t u r n D a t e > + 
+             < E x p e c t e d R e t u r n D a t e > E x p e c t e d R e t u r n D a t e < / E x p e c t e d R e t u r n D a t e > + 
+             < R e n t a l D a t e > R e n t a l D a t e < / R e n t a l D a t e > + 
+             < R e n t a l N o > R e n t a l N o < / R e n t a l N o > + 
+             < S t a t u s > S t a t u s < / S t a t u s > + 
+             < T o t a l A m o u n t > T o t a l A m o u n t < / T o t a l A m o u n t > + 
+             < R e n t a l L i n e > + 
+                 < B i c y c l e N o > B i c y c l e N o < / B i c y c l e N o > + 
+                 < D a i l y R a t e > D a i l y R a t e < / D a i l y R a t e > + 
+                 < D e s c r i p t i o n > D e s c r i p t i o n < / D e s c r i p t i o n > + 
+                 < L i n e A m o u n t > L i n e A m o u n t < / L i n e A m o u n t > + 
+                 < R e n t a l D a y s > R e n t a l D a y s < / R e n t a l D a y s >   
              < / R e n t a l L i n e >   
@@ -2122,7 +2456,7 @@
  < / N a v W o r d R e p o r t X m l P a r t > 
 </file>
 
-<file path=customXml/item2.xml>��< ? x m l   v e r s i o n = " 1 . 0 "   e n c o d i n g = " u t f - 1 6 " ? > < N a v W o r d R e p o r t X m l P a r t   x m l n s = " u r n : m i c r o s o f t - d y n a m i c s - n a v / r e p o r t s / R e n t a l _ R e p o r t / 5 0 1 1 0 / " > +<file path=customXml/item2.xml>��< ? x m l   v e r s i o n = " 1 . 0 "   e n c o d i n g = " u t f - 1 6 " ? > < N a v W o r d R e p o r t X m l P a r t   x m l n s = " u r n : m i c r o s o f t - d y n a m i c s - b u s i n e s s c e n t r a l / i n t e r n a l / e x t e n d e d / r e p o r t s / R e n t a l _ R e p o r t / 5 0 1 1 0 / " >   
      < B C R e p o r t I n f o r m a t i o n >   
@@ -2188,37 +2522,53 @@
  
      < / B C R e p o r t I n f o r m a t i o n >   
-     < C u s t o m e r > - 
-         < C u s t o m e r N a m e > C u s t o m e r N a m e < / C u s t o m e r N a m e > - 
-         < C u s t o m e r N o > C u s t o m e r N o < / C u s t o m e r N o > - 
-         < R e n t a l H e a d e r > - 
-             < A c t u a l R e t u r n D a t e > A c t u a l R e t u r n D a t e < / A c t u a l R e t u r n D a t e > - 
-             < E x p e c t e d R e t u r n D a t e > E x p e c t e d R e t u r n D a t e < / E x p e c t e d R e t u r n D a t e > - 
-             < R e n t a l D a t e > R e n t a l D a t e < / R e n t a l D a t e > - 
-             < R e n t a l N o > R e n t a l N o < / R e n t a l N o > - 
-             < S t a t u s > S t a t u s < / S t a t u s > - 
-             < T o t a l A m o u n t > T o t a l A m o u n t < / T o t a l A m o u n t > - 
-             < R e n t a l L i n e > - 
-                 < B i c y c l e N o > B i c y c l e N o < / B i c y c l e N o > - 
-                 < D a i l y R a t e > D a i l y R a t e < / D a i l y R a t e > - 
-                 < D e s c r i p t i o n > D e s c r i p t i o n < / D e s c r i p t i o n > - 
-                 < L i n e A m o u n t > L i n e A m o u n t < / L i n e A m o u n t > - 
-                 < R e n t a l D a y s > R e n t a l D a y s < / R e n t a l D a y s > +     < T o o l t i p s > + 
+         < T o o l t i p   c o l u m n = " C u s t o m e r N o "   E l e m e n t I d = " 1 5 4 2 0 5 1 5 6 0 " > + 
+             < T o o l t i p T e x t   l a n g = " e n - U S " > S p e c i f i e s   t h e   n u m b e r   o f   t h e   c u s t o m e r .   T h e   f i e l d   i s   e i t h e r   f i l l e d   a u t o m a t i c a l l y   f r o m   a   d e f i n e d   n u m b e r   s e r i e s ,   o r   y o u   e n t e r   t h e   n u m b e r   m a n u a l l y   b e c a u s e   y o u   h a v e   e n a b l e d   m a n u a l   n u m b e r   e n t r y   i n   t h e   n u m b e r - s e r i e s   s e t u p . < / T o o l t i p T e x t > + 
+         < / T o o l t i p > + 
+         < T o o l t i p   c o l u m n = " C u s t o m e r N a m e "   E l e m e n t I d = " 2 6 5 4 9 6 8 2 6 " > + 
+             < T o o l t i p T e x t   l a n g = " e n - U S " > S p e c i f i e s   t h e   c u s t o m e r ' s   n a m e   t h a t   a p p e a r s   o n   a l l   r e l a t e d   d o c u m e n t s .   F o r   c o m p a n i e s ,   s p e c i f y   t h e   c o m p a n y ' s   n a m e   h e r e ,   a n d   t h e n   a d d   t h e   r e l e v a n t   p e o p l e   a s   c o n t a c t s   t h a t   y o u   l i n k   t o   t h i s   c u s t o m e r . < / T o o l t i p T e x t > + 
+         < / T o o l t i p > + 
+     < / T o o l t i p s > + 
+     < C u s t o m e r   E l e m e n t T y p e = " D a t a I t e m "   E l e m e n t I d = " 1 5 2 5 1 9 1 9 9 " > + 
+         < C u s t o m e r N a m e   E l e m e n t T y p e = " C o l u m n "   E l e m e n t I d = " 2 6 5 4 9 6 8 2 6 "   D a t a T y p e = " T e x t " > C u s t o m e r N a m e < / C u s t o m e r N a m e > + 
+         < C u s t o m e r N o   E l e m e n t T y p e = " C o l u m n "   E l e m e n t I d = " 1 5 4 2 0 5 1 5 6 0 "   D a t a T y p e = " C o d e " > C u s t o m e r N o < / C u s t o m e r N o > + 
+         < R e n t a l H e a d e r   E l e m e n t T y p e = " D a t a I t e m "   E l e m e n t I d = " 2 1 4 2 5 9 3 9 4 6 " > + 
+             < A c t u a l R e t u r n D a t e   E l e m e n t T y p e = " C o l u m n "   E l e m e n t I d = " 6 7 7 3 7 2 1 5 5 "   D a t a T y p e = " D a t e " > A c t u a l R e t u r n D a t e < / A c t u a l R e t u r n D a t e > + 
+             < E x p e c t e d R e t u r n D a t e   E l e m e n t T y p e = " C o l u m n "   E l e m e n t I d = " 1 2 3 1 5 5 3 4 0 5 "   D a t a T y p e = " D a t e " > E x p e c t e d R e t u r n D a t e < / E x p e c t e d R e t u r n D a t e > + 
+             < R e n t a l D a t e   E l e m e n t T y p e = " C o l u m n "   E l e m e n t I d = " 5 9 7 4 3 5 9 5 9 "   D a t a T y p e = " D a t e " > R e n t a l D a t e < / R e n t a l D a t e > + 
+             < R e n t a l N o   E l e m e n t T y p e = " C o l u m n "   E l e m e n t I d = " 1 4 6 3 9 1 2 9 0 8 "   D a t a T y p e = " C o d e " > R e n t a l N o < / R e n t a l N o > + 
+             < S t a t u s   E l e m e n t T y p e = " C o l u m n "   E l e m e n t I d = " 1 6 3 4 1 4 4 5 5 1 "   D a t a T y p e = " E n u m " > S t a t u s < / S t a t u s > + 
+             < T o t a l A m o u n t   E l e m e n t T y p e = " C o l u m n "   E l e m e n t I d = " 1 5 5 9 1 6 4 8 7 7 "   D a t a T y p e = " D e c i m a l " > T o t a l A m o u n t < / T o t a l A m o u n t > + 
+             < R e n t a l L i n e   E l e m e n t T y p e = " D a t a I t e m "   E l e m e n t I d = " 1 1 8 7 4 3 2 4 9 9 " > + 
+                 < B i c y c l e N o   E l e m e n t T y p e = " C o l u m n "   E l e m e n t I d = " 1 1 8 7 4 1 5 8 9 7 "   D a t a T y p e = " C o d e " > B i c y c l e N o < / B i c y c l e N o > + 
+                 < D a i l y R a t e   E l e m e n t T y p e = " C o l u m n "   E l e m e n t I d = " 1 5 3 7 8 3 1 9 4 2 "   D a t a T y p e = " D e c i m a l " > D a i l y R a t e < / D a i l y R a t e > + 
+                 < D e s c r i p t i o n   E l e m e n t T y p e = " C o l u m n "   E l e m e n t I d = " 1 3 1 4 3 5 1 3 0 7 "   D a t a T y p e = " T e x t " > D e s c r i p t i o n < / D e s c r i p t i o n > + 
+                 < L i n e A m o u n t   E l e m e n t T y p e = " C o l u m n "   E l e m e n t I d = " 1 6 4 5 5 1 1 0 0 1 "   D a t a T y p e = " D e c i m a l " > L i n e A m o u n t < / L i n e A m o u n t > + 
+                 < R e n t a l D a y s   E l e m e n t T y p e = " C o l u m n "   E l e m e n t I d = " 1 5 2 4 4 1 0 3 1 8 "   D a t a T y p e = " I n t e g e r " > R e n t a l D a y s < / R e n t a l D a y s >   
              < / R e n t a l L i n e >   
@@ -2230,17 +2580,17 @@
 </file>
 
 <file path=customXml/itemProps1.xml><?xml version="1.0" encoding="utf-8"?>
+<ds:datastoreItem xmlns:ds="http://schemas.openxmlformats.org/officeDocument/2006/customXml" ds:itemID="{6389AB1D-60AA-47E6-A136-9AE9D2615019}">
+  <ds:schemaRefs>
+    <ds:schemaRef ds:uri="urn:microsoft-dynamics-nav/reports/Rental_Report/50110/"/>
+  </ds:schemaRefs>
+</ds:datastoreItem>
+</file>
+
+<file path=customXml/itemProps2.xml><?xml version="1.0" encoding="utf-8"?>
 <ds:datastoreItem xmlns:ds="http://schemas.openxmlformats.org/officeDocument/2006/customXml" ds:itemID="{5BAAC60A-105F-4493-85BA-C52B14E81EFD}">
   <ds:schemaRefs>
     <ds:schemaRef ds:uri="urn:microsoft-dynamics-businesscentral/internal/extended/reports/Rental_Report/50110/"/>
   </ds:schemaRefs>
 </ds:datastoreItem>
-</file>
-
-<file path=customXml/itemProps2.xml><?xml version="1.0" encoding="utf-8"?>
-<ds:datastoreItem xmlns:ds="http://schemas.openxmlformats.org/officeDocument/2006/customXml" ds:itemID="{6389AB1D-60AA-47E6-A136-9AE9D2615019}">
-  <ds:schemaRefs>
-    <ds:schemaRef ds:uri="urn:microsoft-dynamics-nav/reports/Rental_Report/50110/"/>
-  </ds:schemaRefs>
-</ds:datastoreItem>
 </file>
</xml_diff>